<commit_message>
Sync from private source SHA: 01b462cbf3be1f9bde64cfc49ace5910883e62ee
</commit_message>
<xml_diff>
--- a/Docs/02Hypothesis_Test/非参数检验-卡方检验-配对样本-ER-分析结果（推荐）.docx
+++ b/Docs/02Hypothesis_Test/非参数检验-卡方检验-配对样本-ER-分析结果（推荐）.docx
@@ -163,7 +163,7 @@
                 <w:vertAlign w:val="baseline"/>
                 <w:lang w:val="en-US" w:eastAsia="zh-CN"/>
               </w:rPr>
-              <w:t>Tools</w:t>
+              <w:t>Treat</w:t>
             </w:r>
           </w:p>
         </w:tc>
@@ -203,8 +203,10 @@
                 <w:vertAlign w:val="baseline"/>
                 <w:lang w:val="en-US" w:eastAsia="zh-CN"/>
               </w:rPr>
-              <w:t>New</w:t>
-            </w:r>
+              <w:t>Post</w:t>
+            </w:r>
+            <w:bookmarkStart w:id="0" w:name="_GoBack"/>
+            <w:bookmarkEnd w:id="0"/>
           </w:p>
         </w:tc>
         <w:tc>
@@ -650,7 +652,7 @@
                 <w:vertAlign w:val="baseline"/>
                 <w:lang w:val="en-US" w:eastAsia="zh-CN"/>
               </w:rPr>
-              <w:t>Initial</w:t>
+              <w:t>Pre</w:t>
             </w:r>
           </w:p>
         </w:tc>
@@ -2890,8 +2892,6 @@
               </w:rPr>
               <w:t xml:space="preserve"> </w:t>
             </w:r>
-            <w:bookmarkStart w:id="0" w:name="_GoBack"/>
-            <w:bookmarkEnd w:id="0"/>
             <w:r>
               <w:rPr>
                 <w:rFonts w:hint="eastAsia" w:asciiTheme="minorEastAsia" w:hAnsiTheme="minorEastAsia" w:eastAsiaTheme="minorEastAsia" w:cstheme="minorEastAsia"/>

</xml_diff>

<commit_message>
Sync from private source SHA: 6f24157302c73f380bdb6d3234f78f1fef883f57
</commit_message>
<xml_diff>
--- a/Docs/02Hypothesis_Test/非参数检验-卡方检验-配对样本-ER-分析结果（推荐）.docx
+++ b/Docs/02Hypothesis_Test/非参数检验-卡方检验-配对样本-ER-分析结果（推荐）.docx
@@ -51,7 +51,7 @@
           <w:vertAlign w:val="baseline"/>
           <w:lang w:val="en-US" w:eastAsia="zh-CN"/>
         </w:rPr>
-        <w:t>Initial</w:t>
+        <w:t>Pre</w:t>
       </w:r>
       <w:r>
         <w:rPr>
@@ -60,7 +60,7 @@
           <w:szCs w:val="21"/>
           <w:lang w:val="en-US" w:eastAsia="zh-CN"/>
         </w:rPr>
-        <w:t xml:space="preserve"> * </w:t>
+        <w:t xml:space="preserve">* </w:t>
       </w:r>
       <w:r>
         <w:rPr>
@@ -72,8 +72,10 @@
           <w:vertAlign w:val="baseline"/>
           <w:lang w:val="en-US" w:eastAsia="zh-CN"/>
         </w:rPr>
-        <w:t>New</w:t>
+        <w:t xml:space="preserve">Post </w:t>
       </w:r>
+      <w:bookmarkStart w:id="0" w:name="_GoBack"/>
+      <w:bookmarkEnd w:id="0"/>
       <w:r>
         <w:rPr>
           <w:rFonts w:hint="eastAsia" w:asciiTheme="minorEastAsia" w:hAnsiTheme="minorEastAsia" w:eastAsiaTheme="minorEastAsia" w:cstheme="minorEastAsia"/>
@@ -81,7 +83,7 @@
           <w:szCs w:val="21"/>
           <w:lang w:val="en-US" w:eastAsia="zh-CN"/>
         </w:rPr>
-        <w:t xml:space="preserve"> Crosstabulation</w:t>
+        <w:t>Crosstabulation</w:t>
       </w:r>
       <w:r>
         <w:rPr>
@@ -205,8 +207,6 @@
               </w:rPr>
               <w:t>Post</w:t>
             </w:r>
-            <w:bookmarkStart w:id="0" w:name="_GoBack"/>
-            <w:bookmarkEnd w:id="0"/>
           </w:p>
         </w:tc>
         <w:tc>

</xml_diff>